<commit_message>
Yo'l Guard — iteration 4: media evidence, AI plates/severity, insurer role, rate-limit, push, PWA/offline, i18n (40 tests green)
</commit_message>
<xml_diff>
--- a/YoLGuard_AI_Installation_and_Architecture_Guide.docx
+++ b/YoLGuard_AI_Installation_and_Architecture_Guide.docx
@@ -152,7 +152,7 @@
           </w:tcPr>
           <w:p>
             <w:r>
-              <w:t>FastAPI 0.142.2, Uvicorn 0.54.0, SQLAlchemy 2.1.1, Pydantic 2.13.5, pydantic-settings 2.15.0</w:t>
+              <w:t>FastAPI 0.142.4, Uvicorn 0.54.0, SQLAlchemy 2.0.54 (pinned), Pydantic 2.13.5, pydantic-settings 2.15.0</w:t>
             </w:r>
           </w:p>
         </w:tc>
@@ -240,7 +240,7 @@
           </w:tcPr>
           <w:p>
             <w:r>
-              <w:t>SQLite file (dev/demo); schema is PostgreSQL-compatible (Numeric, server defaults)</w:t>
+              <w:t>SQLite file (dev/demo); schema is PostgreSQL-compatible (Numeric, server defaults). SQLAlchemy pinned to 2.0.54 (2.1.x cp314 wheels fail DLL load on this Win machine)</w:t>
             </w:r>
           </w:p>
         </w:tc>
@@ -263,6 +263,28 @@
           <w:p>
             <w:r>
               <w:t>pymongo 4.18.2 (optional; disabled when MONGODB_URI is empty)</w:t>
+            </w:r>
+          </w:p>
+        </w:tc>
+      </w:tr>
+      <w:tr>
+        <w:tc>
+          <w:tcPr>
+            <w:tcW w:type="dxa" w:w="4320"/>
+          </w:tcPr>
+          <w:p>
+            <w:r>
+              <w:t>Push</w:t>
+            </w:r>
+          </w:p>
+        </w:tc>
+        <w:tc>
+          <w:tcPr>
+            <w:tcW w:type="dxa" w:w="4320"/>
+          </w:tcPr>
+          <w:p>
+            <w:r>
+              <w:t>pywebpush 2.5.0 (VAPID Web Push, optional; polling fallback otherwise)</w:t>
             </w:r>
           </w:p>
         </w:tc>
@@ -306,7 +328,7 @@
           </w:tcPr>
           <w:p>
             <w:r>
-              <w:t>Vanilla HTML/CSS/JS, no build step, Space Grotesk + Manrope (Google Fonts, system fallback)</w:t>
+              <w:t>Vanilla HTML/CSS/JS + Service Worker (PWA, offline queue in IndexedDB), no build step, Space Grotesk + Manrope (Google Fonts, system fallback). i18n: ru/uz/en</w:t>
             </w:r>
           </w:p>
         </w:tc>
@@ -403,11 +425,11 @@
       <w:r>
         <w:t>1. cd &lt;project&gt;\backend</w:t>
         <w:br/>
-        <w:t>2. (optional) create venv: py -m venv .venv &amp;&amp; .venv\Scripts\activate</w:t>
+        <w:t>2. Recommended (isolated): py -m venv .venv &amp;&amp; .venv\Scripts\activate (.venv/ is git-ignored; use it because the global interpreter on this machine has a broken SQLAlchemy 2.1.x install — requirements pin the verified 2.0.54)</w:t>
         <w:br/>
         <w:t>3. Install: py -m pip install -r requirements.txt</w:t>
         <w:br/>
-        <w:t xml:space="preserve">   (fastapi, uvicorn[standard], sqlalchemy, pydantic, pydantic-settings, python-jose[cryptography], python-multipart, pymongo, Pillow, pytest, httpx)</w:t>
+        <w:t xml:space="preserve">   (fastapi, uvicorn[standard], sqlalchemy==2.0.54, pydantic, pydantic-settings, python-jose[cryptography], python-multipart, pymongo, pywebpush, Pillow, pytest, httpx)</w:t>
         <w:br/>
         <w:t>4. Copy .env.example to .env and set a strong SECRET_KEY:</w:t>
         <w:br/>
@@ -421,7 +443,7 @@
         <w:br/>
         <w:t>7. Check: open http://127.0.0.1:8002/health -&gt; {"ok": true}.</w:t>
         <w:br/>
-        <w:t>8. Tests: python -m pytest -q (33 tests: API, rules, AI heuristic, security, hardening).</w:t>
+        <w:t>8. Tests: .venv\Scripts\python -m pytest -q (40 tests: API, rules, AI heuristic, security, hardening, media upload, insurer/push/rate-limit).</w:t>
       </w:r>
     </w:p>
     <w:p>
@@ -482,6 +504,8 @@
         <w:br/>
         <w:t>- Bytes: &lt;backend&gt;\&lt;UPLOAD_DIR&gt;\ (default 'uploads/'), filename {incident}_{kind}_{unixtime}_{rand}{ext}.</w:t>
         <w:br/>
+        <w:t>- Kinds: 6 photo kinds (completeness set) + doc_photo/other + video_scene (MP4/WEBM to 50 MB) + voice_note (MP3/OGG/WAV/FLAC to 10 MB, in-app dictaphone via MediaRecorder). Only photos go to the AI model; media is stored with metadata.</w:t>
+        <w:br/>
         <w:t>- SQL evidence row: kind (allow-list), file_path, sha256 of PROCESSED bytes, mime (from magic bytes, not client headers), size_bytes, status (stored|processing|ready|failed), storage='local', gps from EXIF.</w:t>
         <w:br/>
         <w:t>- Mongo evidence_meta: mirror + CV fields for analytics.</w:t>
@@ -503,9 +527,9 @@
     </w:p>
     <w:p>
       <w:r>
-        <w:t>No build step. Open &lt;project&gt;\frontend\index.html directly, or via backend static mount http://127.0.0.1:8002/app/ (needs backend running). Set the API URL in the Garage tab (default http://127.0.0.1:8002/api/v1; on a phone use the PC LAN IP, not 127.0.0.1).</w:t>
+        <w:t>No build step. Open &lt;project&gt;\frontend\index.html directly, or via backend static mount http://127.0.0.1:8002/app/ (needs backend running). Installable PWA: manifest + icons + Service Worker (sw.js: app-shell cache, Web Push handler). Offline: photo/message queue in IndexedDB with auto-flush on reconnect. Set the API URL in the Garage tab (default http://127.0.0.1:8002/api/v1; on a phone use the PC LAN IP, not 127.0.0.1).</w:t>
         <w:br/>
-        <w:t>Screens: SOS home (session code/status/photo counter + join-by-code card), 4-step case wizard (eligibility -&gt; photo fixation -&gt; AI answer -&gt; specialist answer), Garage (vehicle + API + login), staff Panel (stats, filters, pagination, dossier, verdicts). Design system: road-night tokens in styles.css (off-black + single amber accent), toast notifications, button busy states, skeletons, aria roles.</w:t>
+        <w:t>Screens: SOS home (session code/status/photo counter + join-by-code card), 4-step case wizard (eligibility -&gt; photo fixation -&gt; AI answer -&gt; specialist answer), Garage (vehicle + API + login), staff Panel (stats, filters, pagination, dossier, verdicts). Design system: road-night tokens in styles.css (off-black + single amber accent), toast notifications, button busy states, skeletons, aria roles. Client-side photo check (dark/blurry warning, dHash duplicate detection), video capture, voice recorder, trilingual UI (ru/uz/en switcher, Garage tab), push subscription card (VAPID, polling fallback). AI panel shows recognized plates + damage severity when available.</w:t>
       </w:r>
     </w:p>
     <w:p>
@@ -929,6 +953,134 @@
           </w:tcPr>
           <w:p>
             <w:r>
+              <w:t>VAPID_PUBLIC_KEY</w:t>
+            </w:r>
+          </w:p>
+        </w:tc>
+        <w:tc>
+          <w:tcPr>
+            <w:tcW w:type="dxa" w:w="2880"/>
+          </w:tcPr>
+          <w:p>
+            <w:r>
+              <w:t>YOUR_VAPID_PUBLIC_KEY</w:t>
+            </w:r>
+          </w:p>
+        </w:tc>
+        <w:tc>
+          <w:tcPr>
+            <w:tcW w:type="dxa" w:w="2880"/>
+          </w:tcPr>
+          <w:p>
+            <w:r>
+              <w:t>Empty = push disabled (polling fallback)</w:t>
+            </w:r>
+          </w:p>
+        </w:tc>
+      </w:tr>
+      <w:tr>
+        <w:tc>
+          <w:tcPr>
+            <w:tcW w:type="dxa" w:w="2880"/>
+          </w:tcPr>
+          <w:p>
+            <w:r>
+              <w:t>VAPID_PRIVATE_KEY</w:t>
+            </w:r>
+          </w:p>
+        </w:tc>
+        <w:tc>
+          <w:tcPr>
+            <w:tcW w:type="dxa" w:w="2880"/>
+          </w:tcPr>
+          <w:p>
+            <w:r>
+              <w:t>YOUR_VAPID_PRIVATE_KEY</w:t>
+            </w:r>
+          </w:p>
+        </w:tc>
+        <w:tc>
+          <w:tcPr>
+            <w:tcW w:type="dxa" w:w="2880"/>
+          </w:tcPr>
+          <w:p>
+            <w:r>
+              <w:t>Generate once, never share</w:t>
+            </w:r>
+          </w:p>
+        </w:tc>
+      </w:tr>
+      <w:tr>
+        <w:tc>
+          <w:tcPr>
+            <w:tcW w:type="dxa" w:w="2880"/>
+          </w:tcPr>
+          <w:p>
+            <w:r>
+              <w:t>VAPID_SUBJECT</w:t>
+            </w:r>
+          </w:p>
+        </w:tc>
+        <w:tc>
+          <w:tcPr>
+            <w:tcW w:type="dxa" w:w="2880"/>
+          </w:tcPr>
+          <w:p>
+            <w:r>
+              <w:t>mailto:admin@example.com</w:t>
+            </w:r>
+          </w:p>
+        </w:tc>
+        <w:tc>
+          <w:tcPr>
+            <w:tcW w:type="dxa" w:w="2880"/>
+          </w:tcPr>
+          <w:p>
+            <w:r>
+              <w:t>Push sender identity</w:t>
+            </w:r>
+          </w:p>
+        </w:tc>
+      </w:tr>
+      <w:tr>
+        <w:tc>
+          <w:tcPr>
+            <w:tcW w:type="dxa" w:w="2880"/>
+          </w:tcPr>
+          <w:p>
+            <w:r>
+              <w:t>RATE_LIMIT_ENABLED</w:t>
+            </w:r>
+          </w:p>
+        </w:tc>
+        <w:tc>
+          <w:tcPr>
+            <w:tcW w:type="dxa" w:w="2880"/>
+          </w:tcPr>
+          <w:p>
+            <w:r>
+              <w:t>true</w:t>
+            </w:r>
+          </w:p>
+        </w:tc>
+        <w:tc>
+          <w:tcPr>
+            <w:tcW w:type="dxa" w:w="2880"/>
+          </w:tcPr>
+          <w:p>
+            <w:r>
+              <w:t>Anti-bruteforce on /auth, /join, /evidence-upload; false only for tests</w:t>
+            </w:r>
+          </w:p>
+        </w:tc>
+      </w:tr>
+      <w:tr>
+        <w:tc>
+          <w:tcPr>
+            <w:tcW w:type="dxa" w:w="2880"/>
+          </w:tcPr>
+          <w:p>
+            <w:r>
               <w:t>CORS_ORIGINS</w:t>
             </w:r>
           </w:p>
@@ -1000,6 +1152,12 @@
         <w:br/>
         <w:t>POST /incidents/{id}/claim-package (specialist; needs 2 confirmed participants) -&gt; {package_hash}</w:t>
         <w:br/>
+        <w:t>GET /incidents/{id}/claim-package (participants + specialist/admin/insurer, read-only)</w:t>
+        <w:br/>
+        <w:t>GET /insurer/incidents (insurer+specialist: ready claim packages, read-only)</w:t>
+        <w:br/>
+        <w:t>GET /push/vapid-key, POST /push/subscribe, POST /push/unsubscribe (push on verdicts/messages)</w:t>
+        <w:br/>
         <w:t>GET /reviews/queue, POST /reviews/{id} {verdict,comment} (specialist; pending-only; reject needs comment)</w:t>
         <w:br/>
         <w:t>GET /admin/stats, GET /admin/incidents?skip&amp;limit&amp;status&amp;eligibility, GET /admin/incidents/{id}, POST /admin/incidents/{id}/message (specialist)</w:t>
@@ -1017,7 +1175,7 @@
     </w:p>
     <w:p>
       <w:r>
-        <w:t>Backend: cd backend &amp;&amp; python -m pytest -q. 33 tests: test_api (health, register/login), test_rules (eligibility matrix, completeness), test_ai (heuristic, SVG), test_security (13 P0 tests: private uploads, 403/401 photo access, magic-bytes, oversize, CORS, SECRET_KEY fail-fast), test_flow (E2E photo-&gt;AI-&gt;verdict), test_hardening (10: token types, kind allow-list, XSS escaping, 2-participant claim rule, verdict guards, stats/pagination, ai-history without Mongo, SVG sanitizer). Live Gemini calls are stubbed in tests (conftest).</w:t>
+        <w:t>Backend: cd backend &amp;&amp; (.venv\)python -m pytest -q. 40 tests: test_api, test_rules, test_ai, test_security (13 P0), test_flow (E2E photo-&gt;AI-&gt;verdict), test_hardening (10), test_features4 (7: video/voice upload, AI plates/severity defaults, insurer read-only, push subscribe cycle, rate-limit, upload auth). Live Gemini stubbed (conftest).</w:t>
         <w:br/>
         <w:t>Frontend: node --check app.js ui.js. Manual: backend on :8002 -&gt; open frontend/index.html -&gt; register -&gt; SOS -&gt; triage -&gt; upload photo -&gt; AI step -&gt; admin Panel verdict.</w:t>
         <w:br/>

</xml_diff>

<commit_message>
Yo'l Guard — iteration 5: staff-only EXE, single-confirm flow, dispatcher red texts, dynamic diagram (41 tests green)
</commit_message>
<xml_diff>
--- a/YoLGuard_AI_Installation_and_Architecture_Guide.docx
+++ b/YoLGuard_AI_Installation_and_Architecture_Guide.docx
@@ -529,7 +529,7 @@
       <w:r>
         <w:t>No build step. Open &lt;project&gt;\frontend\index.html directly, or via backend static mount http://127.0.0.1:8002/app/ (needs backend running). Installable PWA: manifest + icons + Service Worker (sw.js: app-shell cache, Web Push handler). Offline: photo/message queue in IndexedDB with auto-flush on reconnect. Set the API URL in the Garage tab (default http://127.0.0.1:8002/api/v1; on a phone use the PC LAN IP, not 127.0.0.1).</w:t>
         <w:br/>
-        <w:t>Screens: SOS home (session code/status/photo counter + join-by-code card), 4-step case wizard (eligibility -&gt; photo fixation -&gt; AI answer -&gt; specialist answer), Garage (vehicle + API + login), staff Panel (stats, filters, pagination, dossier, verdicts). Design system: road-night tokens in styles.css (off-black + single amber accent), toast notifications, button busy states, skeletons, aria roles. Client-side photo check (dark/blurry warning, dHash duplicate detection), video capture, voice recorder, trilingual UI (ru/uz/en switcher, Garage tab), push subscription card (VAPID, polling fallback). AI panel shows recognized plates + damage severity when available.</w:t>
+        <w:t>Screens: SOS home (session code/status/photo counter + optional join-by-code card), 3-step driver wizard (eligibility -&gt; photo fixation -&gt; AI answer -&gt; staff answer), Garage (vehicle + API + login + push + language). No staff UI in web/mobile: verdicts, claim packages and dossiers live in the desktop EXE. Design system: road-night tokens in styles.css (off-black + single amber accent), toast notifications, button busy states, skeletons, aria roles. Client-side photo check (dark/blurry warning, dHash duplicate detection), video capture, voice recorder, trilingual UI (ru/uz/en switcher, Garage tab), push subscription card (VAPID, polling fallback). AI panel shows recognized plates + damage severity when available.</w:t>
       </w:r>
     </w:p>
     <w:p>
@@ -561,11 +561,9 @@
     </w:p>
     <w:p>
       <w:r>
-        <w:t>Two clients, same API:</w:t>
+        <w:t>Staff works ONLY in the desktop app (drivers never see staff UI: no specialist login, no claim buttons, no Panel tab in web/mobile).</w:t>
         <w:br/>
-        <w:t>A) Web Panel (frontend 'Panel' tab, any browser): needs specialist login. Shows stats dashboard (totals, pending, users, photos, red count, Mongo flag), filters (status/eligibility/code search), pagination, case dossier (triage incl. injured count/impact part/comment, participants, photos loaded with auth header, AI diagram + reasoning + casualty note, verdict, messages), message box, verdict comment box, 3 verdict buttons (approved / needs_field / rejected; rejection requires a comment).</w:t>
-        <w:br/>
-        <w:t>B) Desktop EXE (admin\): run py admin\admin_app.py (needs backend running) or build py -m PyInstaller YolGuardAdmin.spec --noconfirm -&gt; admin\dist\YolGuardAdmin.exe. Same dossier, stats bar, photo previews (Pillow), 'Open AI diagram' (sanitized temp HTML), verdict buttons incl. Reject.</w:t>
+        <w:t>Desktop EXE (admin\): run py admin\admin_app.py (needs backend running) or build py -m PyInstaller YolGuardAdmin.spec --noconfirm -&gt; admin\dist\YolGuardAdmin.exe. Dossier, stats bar, photo previews (Pillow), 'Open AI diagram' (sanitized temp HTML), verdict buttons incl. Reject (comment required), 'Build package' (claim-package, needs creator confirmation).</w:t>
         <w:br/>
         <w:t>Key endpoints: GET /admin/stats, GET /admin/incidents?skip&amp;limit&amp;status&amp;eligibility, GET /admin/incidents/{id}, POST /admin/incidents/{id}/message, POST /reviews/{id}.</w:t>
       </w:r>
@@ -1150,7 +1148,7 @@
         <w:br/>
         <w:t>GET/POST /incidents/{id}/messages -&gt; chat driver&lt;-&gt;staff</w:t>
         <w:br/>
-        <w:t>POST /incidents/{id}/claim-package (specialist; needs 2 confirmed participants) -&gt; {package_hash}</w:t>
+        <w:t>POST /incidents/{id}/claim-package (specialist; needs creator side-A confirmation) -&gt; {package_hash}</w:t>
         <w:br/>
         <w:t>GET /incidents/{id}/claim-package (participants + specialist/admin/insurer, read-only)</w:t>
         <w:br/>

</xml_diff>